<commit_message>
Report analize  Support for flight management.
</commit_message>
<xml_diff>
--- a/Capstone-flightbooking.docx
+++ b/Capstone-flightbooking.docx
@@ -28,12 +28,10 @@
       <w:pPr>
         <w:spacing w:after="0" w:line="240" w:lineRule="auto"/>
       </w:pPr>
-      <w:bookmarkStart w:id="0" w:name="_GoBack"/>
       <w:r>
         <w:t>Project Title: Flight Booking Microservices System</w:t>
       </w:r>
     </w:p>
-    <w:bookmarkEnd w:id="0"/>
     <w:p>
       <w:pPr>
         <w:spacing w:after="0" w:line="240" w:lineRule="auto"/>
@@ -1720,7 +1718,18 @@
       <w:pPr>
         <w:spacing w:after="0" w:line="240" w:lineRule="auto"/>
       </w:pPr>
-      <w:r>
+    </w:p>
+    <w:p>
+      <w:pPr>
+        <w:spacing w:after="0" w:line="240" w:lineRule="auto"/>
+      </w:pPr>
+    </w:p>
+    <w:p>
+      <w:pPr>
+        <w:spacing w:after="0" w:line="240" w:lineRule="auto"/>
+      </w:pPr>
+      <w:r>
+        <w:lastRenderedPageBreak/>
         <w:t>5.2. Performance</w:t>
       </w:r>
     </w:p>
@@ -1734,254 +1743,264 @@
         <w:spacing w:after="0" w:line="240" w:lineRule="auto"/>
       </w:pPr>
       <w:r>
+        <w:t>Response Time:</w:t>
+      </w:r>
+    </w:p>
+    <w:p>
+      <w:pPr>
+        <w:spacing w:after="0" w:line="240" w:lineRule="auto"/>
+      </w:pPr>
+    </w:p>
+    <w:p>
+      <w:pPr>
+        <w:spacing w:after="0" w:line="240" w:lineRule="auto"/>
+      </w:pPr>
+      <w:r>
+        <w:t>The system should respond to user requests within 200 milliseconds for 95% of operations.</w:t>
+      </w:r>
+    </w:p>
+    <w:p>
+      <w:pPr>
+        <w:spacing w:after="0" w:line="240" w:lineRule="auto"/>
+      </w:pPr>
+    </w:p>
+    <w:p>
+      <w:pPr>
+        <w:spacing w:after="0" w:line="240" w:lineRule="auto"/>
+      </w:pPr>
+      <w:r>
+        <w:t>For batch processing tasks (e.g., bulk transactions), the maximum acceptable response time should not exceed 2 seconds.</w:t>
+      </w:r>
+    </w:p>
+    <w:p>
+      <w:pPr>
+        <w:spacing w:after="0" w:line="240" w:lineRule="auto"/>
+      </w:pPr>
+    </w:p>
+    <w:p>
+      <w:pPr>
+        <w:spacing w:after="0" w:line="240" w:lineRule="auto"/>
+      </w:pPr>
+      <w:r>
+        <w:t>Throughput: Each microservice should handle a minimum of 100 transactions per second under normal load conditions.</w:t>
+      </w:r>
+    </w:p>
+    <w:p>
+      <w:pPr>
+        <w:spacing w:after="0" w:line="240" w:lineRule="auto"/>
+      </w:pPr>
+    </w:p>
+    <w:p>
+      <w:pPr>
+        <w:spacing w:after="0" w:line="240" w:lineRule="auto"/>
+      </w:pPr>
+      <w:r>
+        <w:t>5.3. Security</w:t>
+      </w:r>
+    </w:p>
+    <w:p>
+      <w:pPr>
+        <w:spacing w:after="0" w:line="240" w:lineRule="auto"/>
+      </w:pPr>
+    </w:p>
+    <w:p>
+      <w:pPr>
+        <w:spacing w:after="0" w:line="240" w:lineRule="auto"/>
+      </w:pPr>
+      <w:r>
+        <w:t>Data Encryption:</w:t>
+      </w:r>
+    </w:p>
+    <w:p>
+      <w:pPr>
+        <w:spacing w:after="0" w:line="240" w:lineRule="auto"/>
+      </w:pPr>
+    </w:p>
+    <w:p>
+      <w:pPr>
+        <w:spacing w:after="0" w:line="240" w:lineRule="auto"/>
+      </w:pPr>
+      <w:r>
+        <w:t>Sensitive data (e.g., user credentials, personal information) must be encrypted in MySQL, using AES-256 encryption.</w:t>
+      </w:r>
+    </w:p>
+    <w:p>
+      <w:pPr>
+        <w:spacing w:after="0" w:line="240" w:lineRule="auto"/>
+      </w:pPr>
+    </w:p>
+    <w:p>
+      <w:pPr>
+        <w:spacing w:after="0" w:line="240" w:lineRule="auto"/>
+      </w:pPr>
+      <w:r>
+        <w:t>All communication between microservices must be encrypted using TLS</w:t>
+      </w:r>
+    </w:p>
+    <w:p>
+      <w:pPr>
+        <w:spacing w:after="0" w:line="240" w:lineRule="auto"/>
+      </w:pPr>
+    </w:p>
+    <w:p>
+      <w:pPr>
+        <w:spacing w:after="0" w:line="240" w:lineRule="auto"/>
+      </w:pPr>
+      <w:r>
+        <w:t>(Transport Layer Security). Authentication and Authorization:</w:t>
+      </w:r>
+    </w:p>
+    <w:p>
+      <w:pPr>
+        <w:spacing w:after="0" w:line="240" w:lineRule="auto"/>
+      </w:pPr>
+    </w:p>
+    <w:p>
+      <w:pPr>
+        <w:spacing w:after="0" w:line="240" w:lineRule="auto"/>
+      </w:pPr>
+      <w:r>
+        <w:t>Implement OAuth2 for user authentication, utilizing JWTs (JSON Web Tokens) for secure token-based access.</w:t>
+      </w:r>
+    </w:p>
+    <w:p>
+      <w:pPr>
+        <w:spacing w:after="0" w:line="240" w:lineRule="auto"/>
+      </w:pPr>
+    </w:p>
+    <w:p>
+      <w:pPr>
+        <w:spacing w:after="0" w:line="240" w:lineRule="auto"/>
+      </w:pPr>
+      <w:r>
+        <w:t>Tokens must have an expiration time of 15 minutes and should be refreshable without re-authentication for active sessions.</w:t>
+      </w:r>
+    </w:p>
+    <w:p>
+      <w:pPr>
+        <w:spacing w:after="0" w:line="240" w:lineRule="auto"/>
+      </w:pPr>
+    </w:p>
+    <w:p>
+      <w:pPr>
+        <w:spacing w:after="0" w:line="240" w:lineRule="auto"/>
+      </w:pPr>
+      <w:r>
+        <w:t>Capstone Projects</w:t>
+      </w:r>
+    </w:p>
+    <w:p>
+      <w:pPr>
+        <w:spacing w:after="0" w:line="240" w:lineRule="auto"/>
+      </w:pPr>
+    </w:p>
+    <w:p>
+      <w:pPr>
+        <w:spacing w:after="0" w:line="240" w:lineRule="auto"/>
+      </w:pPr>
+      <w:r>
+        <w:t>Project Require</w:t>
+      </w:r>
+    </w:p>
+    <w:p>
+      <w:pPr>
+        <w:spacing w:after="0" w:line="240" w:lineRule="auto"/>
+      </w:pPr>
+    </w:p>
+    <w:p>
+      <w:pPr>
+        <w:spacing w:after="0" w:line="240" w:lineRule="auto"/>
+      </w:pPr>
+      <w:r>
+        <w:t>5.4. Availability</w:t>
+      </w:r>
+    </w:p>
+    <w:p>
+      <w:pPr>
+        <w:spacing w:after="0" w:line="240" w:lineRule="auto"/>
+      </w:pPr>
+    </w:p>
+    <w:p>
+      <w:pPr>
+        <w:spacing w:after="0" w:line="240" w:lineRule="auto"/>
+      </w:pPr>
+      <w:r>
+        <w:t>Uptime Requirement: The system must achieve 99.9% availability, with scheduled maintenance windows communicated in advance to users.</w:t>
+      </w:r>
+    </w:p>
+    <w:p>
+      <w:pPr>
+        <w:spacing w:after="0" w:line="240" w:lineRule="auto"/>
+      </w:pPr>
+    </w:p>
+    <w:p>
+      <w:pPr>
+        <w:spacing w:after="0" w:line="240" w:lineRule="auto"/>
+      </w:pPr>
+      <w:r>
+        <w:t>Failover Mechanisms: Implement circuit breaker patterns using Spring Cloud Resilience4j to prevent cascading failures and ensure resilience under load.</w:t>
+      </w:r>
+    </w:p>
+    <w:p>
+      <w:pPr>
+        <w:spacing w:after="0" w:line="240" w:lineRule="auto"/>
+      </w:pPr>
+    </w:p>
+    <w:p>
+      <w:pPr>
+        <w:spacing w:after="0" w:line="240" w:lineRule="auto"/>
+      </w:pPr>
+      <w:r>
+        <w:t>5.5. Compliance</w:t>
+      </w:r>
+    </w:p>
+    <w:p>
+      <w:pPr>
+        <w:spacing w:after="0" w:line="240" w:lineRule="auto"/>
+      </w:pPr>
+    </w:p>
+    <w:p>
+      <w:pPr>
+        <w:spacing w:after="0" w:line="240" w:lineRule="auto"/>
+      </w:pPr>
+      <w:r>
+        <w:t>Data Protection: Ensure compliance with relevant data protection regulations such as GDPR and PCI DSS.</w:t>
+      </w:r>
+    </w:p>
+    <w:p>
+      <w:pPr>
+        <w:spacing w:after="0" w:line="240" w:lineRule="auto"/>
+      </w:pPr>
+    </w:p>
+    <w:p>
+      <w:pPr>
+        <w:spacing w:after="0" w:line="240" w:lineRule="auto"/>
+      </w:pPr>
+      <w:r>
+        <w:t>Audit Logging: Maintain detailed logs of user activities, access events, and system changes for audit purposes. Logs should be retained for a minimum of 6 months.</w:t>
+      </w:r>
+    </w:p>
+    <w:p>
+      <w:pPr>
+        <w:spacing w:after="0" w:line="240" w:lineRule="auto"/>
+      </w:pPr>
+    </w:p>
+    <w:p>
+      <w:pPr>
+        <w:spacing w:after="0" w:line="240" w:lineRule="auto"/>
+      </w:pPr>
+    </w:p>
+    <w:p>
+      <w:pPr>
+        <w:spacing w:after="0" w:line="240" w:lineRule="auto"/>
+      </w:pPr>
+    </w:p>
+    <w:p>
+      <w:pPr>
+        <w:spacing w:after="0" w:line="240" w:lineRule="auto"/>
+      </w:pPr>
+      <w:r>
         <w:lastRenderedPageBreak/>
-        <w:t>Response Time:</w:t>
-      </w:r>
-    </w:p>
-    <w:p>
-      <w:pPr>
-        <w:spacing w:after="0" w:line="240" w:lineRule="auto"/>
-      </w:pPr>
-    </w:p>
-    <w:p>
-      <w:pPr>
-        <w:spacing w:after="0" w:line="240" w:lineRule="auto"/>
-      </w:pPr>
-      <w:r>
-        <w:t>The system should respond to user requests within 200 milliseconds for 95% of operations.</w:t>
-      </w:r>
-    </w:p>
-    <w:p>
-      <w:pPr>
-        <w:spacing w:after="0" w:line="240" w:lineRule="auto"/>
-      </w:pPr>
-    </w:p>
-    <w:p>
-      <w:pPr>
-        <w:spacing w:after="0" w:line="240" w:lineRule="auto"/>
-      </w:pPr>
-      <w:r>
-        <w:t>For batch processing tasks (e.g., bulk transactions), the maximum acceptable response time should not exceed 2 seconds.</w:t>
-      </w:r>
-    </w:p>
-    <w:p>
-      <w:pPr>
-        <w:spacing w:after="0" w:line="240" w:lineRule="auto"/>
-      </w:pPr>
-    </w:p>
-    <w:p>
-      <w:pPr>
-        <w:spacing w:after="0" w:line="240" w:lineRule="auto"/>
-      </w:pPr>
-      <w:r>
-        <w:t>Throughput: Each microservice should handle a minimum of 100 transactions per second under normal load conditions.</w:t>
-      </w:r>
-    </w:p>
-    <w:p>
-      <w:pPr>
-        <w:spacing w:after="0" w:line="240" w:lineRule="auto"/>
-      </w:pPr>
-    </w:p>
-    <w:p>
-      <w:pPr>
-        <w:spacing w:after="0" w:line="240" w:lineRule="auto"/>
-      </w:pPr>
-      <w:r>
-        <w:t>5.3. Security</w:t>
-      </w:r>
-    </w:p>
-    <w:p>
-      <w:pPr>
-        <w:spacing w:after="0" w:line="240" w:lineRule="auto"/>
-      </w:pPr>
-    </w:p>
-    <w:p>
-      <w:pPr>
-        <w:spacing w:after="0" w:line="240" w:lineRule="auto"/>
-      </w:pPr>
-      <w:r>
-        <w:t>Data Encryption:</w:t>
-      </w:r>
-    </w:p>
-    <w:p>
-      <w:pPr>
-        <w:spacing w:after="0" w:line="240" w:lineRule="auto"/>
-      </w:pPr>
-    </w:p>
-    <w:p>
-      <w:pPr>
-        <w:spacing w:after="0" w:line="240" w:lineRule="auto"/>
-      </w:pPr>
-      <w:r>
-        <w:t>Sensitive data (e.g., user credentials, personal information) must be encrypted in MySQL, using AES-256 encryption.</w:t>
-      </w:r>
-    </w:p>
-    <w:p>
-      <w:pPr>
-        <w:spacing w:after="0" w:line="240" w:lineRule="auto"/>
-      </w:pPr>
-    </w:p>
-    <w:p>
-      <w:pPr>
-        <w:spacing w:after="0" w:line="240" w:lineRule="auto"/>
-      </w:pPr>
-      <w:r>
-        <w:t>All communication between microservices must be encrypted using TLS</w:t>
-      </w:r>
-    </w:p>
-    <w:p>
-      <w:pPr>
-        <w:spacing w:after="0" w:line="240" w:lineRule="auto"/>
-      </w:pPr>
-    </w:p>
-    <w:p>
-      <w:pPr>
-        <w:spacing w:after="0" w:line="240" w:lineRule="auto"/>
-      </w:pPr>
-      <w:r>
-        <w:t>(Transport Layer Security). Authentication and Authorization:</w:t>
-      </w:r>
-    </w:p>
-    <w:p>
-      <w:pPr>
-        <w:spacing w:after="0" w:line="240" w:lineRule="auto"/>
-      </w:pPr>
-    </w:p>
-    <w:p>
-      <w:pPr>
-        <w:spacing w:after="0" w:line="240" w:lineRule="auto"/>
-      </w:pPr>
-      <w:r>
-        <w:t>Implement OAuth2 for user authentication, utilizing JWTs (JSON Web Tokens) for secure token-based access.</w:t>
-      </w:r>
-    </w:p>
-    <w:p>
-      <w:pPr>
-        <w:spacing w:after="0" w:line="240" w:lineRule="auto"/>
-      </w:pPr>
-    </w:p>
-    <w:p>
-      <w:pPr>
-        <w:spacing w:after="0" w:line="240" w:lineRule="auto"/>
-      </w:pPr>
-      <w:r>
-        <w:t>Tokens must have an expiration time of 15 minutes and should be refreshable without re-authentication for active sessions.</w:t>
-      </w:r>
-    </w:p>
-    <w:p>
-      <w:pPr>
-        <w:spacing w:after="0" w:line="240" w:lineRule="auto"/>
-      </w:pPr>
-    </w:p>
-    <w:p>
-      <w:pPr>
-        <w:spacing w:after="0" w:line="240" w:lineRule="auto"/>
-      </w:pPr>
-      <w:r>
-        <w:t>Capstone Projects</w:t>
-      </w:r>
-    </w:p>
-    <w:p>
-      <w:pPr>
-        <w:spacing w:after="0" w:line="240" w:lineRule="auto"/>
-      </w:pPr>
-    </w:p>
-    <w:p>
-      <w:pPr>
-        <w:spacing w:after="0" w:line="240" w:lineRule="auto"/>
-      </w:pPr>
-      <w:r>
-        <w:t>Project Require</w:t>
-      </w:r>
-    </w:p>
-    <w:p>
-      <w:pPr>
-        <w:spacing w:after="0" w:line="240" w:lineRule="auto"/>
-      </w:pPr>
-    </w:p>
-    <w:p>
-      <w:pPr>
-        <w:spacing w:after="0" w:line="240" w:lineRule="auto"/>
-      </w:pPr>
-      <w:r>
-        <w:t>5.4. Availability</w:t>
-      </w:r>
-    </w:p>
-    <w:p>
-      <w:pPr>
-        <w:spacing w:after="0" w:line="240" w:lineRule="auto"/>
-      </w:pPr>
-    </w:p>
-    <w:p>
-      <w:pPr>
-        <w:spacing w:after="0" w:line="240" w:lineRule="auto"/>
-      </w:pPr>
-      <w:r>
-        <w:t>Uptime Requirement: The system must achieve 99.9% availability, with scheduled maintenance windows communicated in advance to users.</w:t>
-      </w:r>
-    </w:p>
-    <w:p>
-      <w:pPr>
-        <w:spacing w:after="0" w:line="240" w:lineRule="auto"/>
-      </w:pPr>
-    </w:p>
-    <w:p>
-      <w:pPr>
-        <w:spacing w:after="0" w:line="240" w:lineRule="auto"/>
-      </w:pPr>
-      <w:r>
-        <w:t>Failover Mechanisms: Implement circuit breaker patterns using Spring Cloud Resilience4j to prevent cascading failures and ensure resilience under load.</w:t>
-      </w:r>
-    </w:p>
-    <w:p>
-      <w:pPr>
-        <w:spacing w:after="0" w:line="240" w:lineRule="auto"/>
-      </w:pPr>
-    </w:p>
-    <w:p>
-      <w:pPr>
-        <w:spacing w:after="0" w:line="240" w:lineRule="auto"/>
-      </w:pPr>
-      <w:r>
-        <w:t>5.5. Compliance</w:t>
-      </w:r>
-    </w:p>
-    <w:p>
-      <w:pPr>
-        <w:spacing w:after="0" w:line="240" w:lineRule="auto"/>
-      </w:pPr>
-    </w:p>
-    <w:p>
-      <w:pPr>
-        <w:spacing w:after="0" w:line="240" w:lineRule="auto"/>
-      </w:pPr>
-      <w:r>
-        <w:t>Data Protection: Ensure compliance with relevant data protection regulations such as GDPR and PCI DSS.</w:t>
-      </w:r>
-    </w:p>
-    <w:p>
-      <w:pPr>
-        <w:spacing w:after="0" w:line="240" w:lineRule="auto"/>
-      </w:pPr>
-    </w:p>
-    <w:p>
-      <w:pPr>
-        <w:spacing w:after="0" w:line="240" w:lineRule="auto"/>
-      </w:pPr>
-      <w:r>
-        <w:t>Audit Logging: Maintain detailed logs of user activities, access events, and system changes for audit purposes. Logs should be retained for a minimum of 6 months.</w:t>
-      </w:r>
-    </w:p>
-    <w:p>
-      <w:pPr>
-        <w:spacing w:after="0" w:line="240" w:lineRule="auto"/>
-      </w:pPr>
-    </w:p>
-    <w:p>
-      <w:pPr>
-        <w:spacing w:after="0" w:line="240" w:lineRule="auto"/>
-      </w:pPr>
-      <w:r>
         <w:t>5.6. Reliability</w:t>
       </w:r>
     </w:p>
@@ -2060,7 +2079,12 @@
         <w:spacing w:after="0" w:line="240" w:lineRule="auto"/>
       </w:pPr>
       <w:r>
-        <w:t>CUCD Pipeline: Establish a Continuous Integration/Continuous Deployment (CI/CD) pipeline using tools like Jenkins or GitLab CI for automated testing and deployment of microservices.</w:t>
+        <w:t>CI</w:t>
+      </w:r>
+      <w:bookmarkStart w:id="0" w:name="_GoBack"/>
+      <w:bookmarkEnd w:id="0"/>
+      <w:r>
+        <w:t>CD Pipeline: Establish a Continuous Integration/Continuous Deployment (CI/CD) pipeline using tools like Jenkins or GitLab CI for automated testing and deployment of microservices.</w:t>
       </w:r>
     </w:p>
     <w:p>
@@ -2216,13 +2240,8 @@
         <w:spacing w:after="0" w:line="240" w:lineRule="auto"/>
       </w:pPr>
       <w:r>
-        <w:t xml:space="preserve">above requirement can you prepare one </w:t>
-      </w:r>
-      <w:proofErr w:type="gramStart"/>
-      <w:r>
-        <w:t>document..</w:t>
-      </w:r>
-      <w:proofErr w:type="gramEnd"/>
+        <w:t>above requirement can you prepare one document..</w:t>
+      </w:r>
     </w:p>
     <w:sectPr>
       <w:pgSz w:w="11906" w:h="16838"/>

</xml_diff>